<commit_message>
feat: natural 3-step decision journey connecting daily routine, competing choices, and tangible physical outcomes
</commit_message>
<xml_diff>
--- a/bca_report_output/BCA_Project_Report_Resume_Analysis.docx
+++ b/bca_report_output/BCA_Project_Report_Resume_Analysis.docx
@@ -927,7 +927,7 @@
                 <w:rFonts w:ascii="Times New Roman" w:hAnsi="Times New Roman"/>
                 <w:sz w:val="18"/>
               </w:rPr>
-              <w:t>1</w:t>
+              <w:t>2</w:t>
             </w:r>
           </w:p>
         </w:tc>
@@ -1021,7 +1021,7 @@
                 <w:rFonts w:ascii="Times New Roman" w:hAnsi="Times New Roman"/>
                 <w:sz w:val="18"/>
               </w:rPr>
-              <w:t>2</w:t>
+              <w:t>3</w:t>
             </w:r>
           </w:p>
         </w:tc>
@@ -1070,7 +1070,7 @@
                 <w:b/>
                 <w:sz w:val="18"/>
               </w:rPr>
-              <w:t>3</w:t>
+              <w:t>4</w:t>
             </w:r>
           </w:p>
         </w:tc>
@@ -1117,7 +1117,7 @@
                 <w:rFonts w:ascii="Times New Roman" w:hAnsi="Times New Roman"/>
                 <w:sz w:val="18"/>
               </w:rPr>
-              <w:t>3</w:t>
+              <w:t>4</w:t>
             </w:r>
           </w:p>
         </w:tc>
@@ -1164,7 +1164,7 @@
                 <w:rFonts w:ascii="Times New Roman" w:hAnsi="Times New Roman"/>
                 <w:sz w:val="18"/>
               </w:rPr>
-              <w:t>3</w:t>
+              <w:t>4</w:t>
             </w:r>
           </w:p>
         </w:tc>
@@ -1211,7 +1211,7 @@
                 <w:rFonts w:ascii="Times New Roman" w:hAnsi="Times New Roman"/>
                 <w:sz w:val="18"/>
               </w:rPr>
-              <w:t>3</w:t>
+              <w:t>4</w:t>
             </w:r>
           </w:p>
         </w:tc>
@@ -1258,7 +1258,7 @@
                 <w:rFonts w:ascii="Times New Roman" w:hAnsi="Times New Roman"/>
                 <w:sz w:val="18"/>
               </w:rPr>
-              <w:t>3</w:t>
+              <w:t>4</w:t>
             </w:r>
           </w:p>
         </w:tc>
@@ -1305,7 +1305,7 @@
                 <w:rFonts w:ascii="Times New Roman" w:hAnsi="Times New Roman"/>
                 <w:sz w:val="18"/>
               </w:rPr>
-              <w:t>3</w:t>
+              <w:t>4</w:t>
             </w:r>
           </w:p>
         </w:tc>
@@ -1352,7 +1352,7 @@
                 <w:rFonts w:ascii="Times New Roman" w:hAnsi="Times New Roman"/>
                 <w:sz w:val="18"/>
               </w:rPr>
-              <w:t>3</w:t>
+              <w:t>4</w:t>
             </w:r>
           </w:p>
         </w:tc>
@@ -1399,7 +1399,7 @@
                 <w:rFonts w:ascii="Times New Roman" w:hAnsi="Times New Roman"/>
                 <w:sz w:val="18"/>
               </w:rPr>
-              <w:t>3</w:t>
+              <w:t>4</w:t>
             </w:r>
           </w:p>
         </w:tc>
@@ -1446,7 +1446,7 @@
                 <w:rFonts w:ascii="Times New Roman" w:hAnsi="Times New Roman"/>
                 <w:sz w:val="18"/>
               </w:rPr>
-              <w:t>3</w:t>
+              <w:t>4</w:t>
             </w:r>
           </w:p>
         </w:tc>
@@ -1493,7 +1493,7 @@
                 <w:rFonts w:ascii="Times New Roman" w:hAnsi="Times New Roman"/>
                 <w:sz w:val="18"/>
               </w:rPr>
-              <w:t>3</w:t>
+              <w:t>4</w:t>
             </w:r>
           </w:p>
         </w:tc>
@@ -1540,7 +1540,7 @@
                 <w:rFonts w:ascii="Times New Roman" w:hAnsi="Times New Roman"/>
                 <w:sz w:val="18"/>
               </w:rPr>
-              <w:t>3</w:t>
+              <w:t>4</w:t>
             </w:r>
           </w:p>
         </w:tc>
@@ -1587,7 +1587,7 @@
                 <w:rFonts w:ascii="Times New Roman" w:hAnsi="Times New Roman"/>
                 <w:sz w:val="18"/>
               </w:rPr>
-              <w:t>4</w:t>
+              <w:t>5</w:t>
             </w:r>
           </w:p>
         </w:tc>
@@ -1634,7 +1634,7 @@
                 <w:rFonts w:ascii="Times New Roman" w:hAnsi="Times New Roman"/>
                 <w:sz w:val="18"/>
               </w:rPr>
-              <w:t>4</w:t>
+              <w:t>5</w:t>
             </w:r>
           </w:p>
         </w:tc>
@@ -1681,7 +1681,7 @@
                 <w:rFonts w:ascii="Times New Roman" w:hAnsi="Times New Roman"/>
                 <w:sz w:val="18"/>
               </w:rPr>
-              <w:t>4</w:t>
+              <w:t>5</w:t>
             </w:r>
           </w:p>
         </w:tc>
@@ -1728,7 +1728,7 @@
                 <w:rFonts w:ascii="Times New Roman" w:hAnsi="Times New Roman"/>
                 <w:sz w:val="18"/>
               </w:rPr>
-              <w:t>4</w:t>
+              <w:t>5</w:t>
             </w:r>
           </w:p>
         </w:tc>
@@ -1775,7 +1775,7 @@
                 <w:rFonts w:ascii="Times New Roman" w:hAnsi="Times New Roman"/>
                 <w:sz w:val="18"/>
               </w:rPr>
-              <w:t>4</w:t>
+              <w:t>6</w:t>
             </w:r>
           </w:p>
         </w:tc>
@@ -1824,7 +1824,7 @@
                 <w:b/>
                 <w:sz w:val="18"/>
               </w:rPr>
-              <w:t>7</w:t>
+              <w:t>8</w:t>
             </w:r>
           </w:p>
         </w:tc>
@@ -1871,7 +1871,7 @@
                 <w:rFonts w:ascii="Times New Roman" w:hAnsi="Times New Roman"/>
                 <w:sz w:val="18"/>
               </w:rPr>
-              <w:t>7</w:t>
+              <w:t>8</w:t>
             </w:r>
           </w:p>
         </w:tc>
@@ -1918,7 +1918,7 @@
                 <w:rFonts w:ascii="Times New Roman" w:hAnsi="Times New Roman"/>
                 <w:sz w:val="18"/>
               </w:rPr>
-              <w:t>7</w:t>
+              <w:t>8</w:t>
             </w:r>
           </w:p>
         </w:tc>
@@ -1965,7 +1965,7 @@
                 <w:rFonts w:ascii="Times New Roman" w:hAnsi="Times New Roman"/>
                 <w:sz w:val="18"/>
               </w:rPr>
-              <w:t>8</w:t>
+              <w:t>9</w:t>
             </w:r>
           </w:p>
         </w:tc>
@@ -2012,7 +2012,7 @@
                 <w:rFonts w:ascii="Times New Roman" w:hAnsi="Times New Roman"/>
                 <w:sz w:val="18"/>
               </w:rPr>
-              <w:t>8</w:t>
+              <w:t>9</w:t>
             </w:r>
           </w:p>
         </w:tc>
@@ -2059,7 +2059,7 @@
                 <w:rFonts w:ascii="Times New Roman" w:hAnsi="Times New Roman"/>
                 <w:sz w:val="18"/>
               </w:rPr>
-              <w:t>9</w:t>
+              <w:t>10</w:t>
             </w:r>
           </w:p>
         </w:tc>
@@ -2106,7 +2106,7 @@
                 <w:rFonts w:ascii="Times New Roman" w:hAnsi="Times New Roman"/>
                 <w:sz w:val="18"/>
               </w:rPr>
-              <w:t>10</w:t>
+              <w:t>11</w:t>
             </w:r>
           </w:p>
         </w:tc>
@@ -2153,7 +2153,7 @@
                 <w:rFonts w:ascii="Times New Roman" w:hAnsi="Times New Roman"/>
                 <w:sz w:val="18"/>
               </w:rPr>
-              <w:t>10</w:t>
+              <w:t>11</w:t>
             </w:r>
           </w:p>
         </w:tc>
@@ -2200,7 +2200,7 @@
                 <w:rFonts w:ascii="Times New Roman" w:hAnsi="Times New Roman"/>
                 <w:sz w:val="18"/>
               </w:rPr>
-              <w:t>10</w:t>
+              <w:t>11</w:t>
             </w:r>
           </w:p>
         </w:tc>
@@ -2249,7 +2249,7 @@
                 <w:b/>
                 <w:sz w:val="18"/>
               </w:rPr>
-              <w:t>11</w:t>
+              <w:t>13</w:t>
             </w:r>
           </w:p>
         </w:tc>
@@ -2296,7 +2296,7 @@
                 <w:rFonts w:ascii="Times New Roman" w:hAnsi="Times New Roman"/>
                 <w:sz w:val="18"/>
               </w:rPr>
-              <w:t>11</w:t>
+              <w:t>13</w:t>
             </w:r>
           </w:p>
         </w:tc>
@@ -2343,7 +2343,7 @@
                 <w:rFonts w:ascii="Times New Roman" w:hAnsi="Times New Roman"/>
                 <w:sz w:val="18"/>
               </w:rPr>
-              <w:t>11</w:t>
+              <w:t>13</w:t>
             </w:r>
           </w:p>
         </w:tc>
@@ -2390,7 +2390,7 @@
                 <w:rFonts w:ascii="Times New Roman" w:hAnsi="Times New Roman"/>
                 <w:sz w:val="18"/>
               </w:rPr>
-              <w:t>11</w:t>
+              <w:t>13</w:t>
             </w:r>
           </w:p>
         </w:tc>
@@ -2437,7 +2437,7 @@
                 <w:rFonts w:ascii="Times New Roman" w:hAnsi="Times New Roman"/>
                 <w:sz w:val="18"/>
               </w:rPr>
-              <w:t>11</w:t>
+              <w:t>13</w:t>
             </w:r>
           </w:p>
         </w:tc>
@@ -2484,7 +2484,7 @@
                 <w:rFonts w:ascii="Times New Roman" w:hAnsi="Times New Roman"/>
                 <w:sz w:val="18"/>
               </w:rPr>
-              <w:t>11</w:t>
+              <w:t>14</w:t>
             </w:r>
           </w:p>
         </w:tc>
@@ -2531,7 +2531,7 @@
                 <w:rFonts w:ascii="Times New Roman" w:hAnsi="Times New Roman"/>
                 <w:sz w:val="18"/>
               </w:rPr>
-              <w:t>12</w:t>
+              <w:t>14</w:t>
             </w:r>
           </w:p>
         </w:tc>
@@ -2578,7 +2578,7 @@
                 <w:rFonts w:ascii="Times New Roman" w:hAnsi="Times New Roman"/>
                 <w:sz w:val="18"/>
               </w:rPr>
-              <w:t>12</w:t>
+              <w:t>15</w:t>
             </w:r>
           </w:p>
         </w:tc>
@@ -2625,7 +2625,7 @@
                 <w:rFonts w:ascii="Times New Roman" w:hAnsi="Times New Roman"/>
                 <w:sz w:val="18"/>
               </w:rPr>
-              <w:t>14</w:t>
+              <w:t>17</w:t>
             </w:r>
           </w:p>
         </w:tc>
@@ -2674,7 +2674,7 @@
                 <w:b/>
                 <w:sz w:val="18"/>
               </w:rPr>
-              <w:t>16</w:t>
+              <w:t>19</w:t>
             </w:r>
           </w:p>
         </w:tc>
@@ -2721,7 +2721,7 @@
                 <w:rFonts w:ascii="Times New Roman" w:hAnsi="Times New Roman"/>
                 <w:sz w:val="18"/>
               </w:rPr>
-              <w:t>16</w:t>
+              <w:t>19</w:t>
             </w:r>
           </w:p>
         </w:tc>
@@ -2768,7 +2768,7 @@
                 <w:rFonts w:ascii="Times New Roman" w:hAnsi="Times New Roman"/>
                 <w:sz w:val="18"/>
               </w:rPr>
-              <w:t>16</w:t>
+              <w:t>19</w:t>
             </w:r>
           </w:p>
         </w:tc>
@@ -2815,7 +2815,7 @@
                 <w:rFonts w:ascii="Times New Roman" w:hAnsi="Times New Roman"/>
                 <w:sz w:val="18"/>
               </w:rPr>
-              <w:t>16</w:t>
+              <w:t>20</w:t>
             </w:r>
           </w:p>
         </w:tc>
@@ -2864,7 +2864,7 @@
                 <w:b/>
                 <w:sz w:val="18"/>
               </w:rPr>
-              <w:t>17</w:t>
+              <w:t>21</w:t>
             </w:r>
           </w:p>
         </w:tc>
@@ -2911,7 +2911,7 @@
                 <w:rFonts w:ascii="Times New Roman" w:hAnsi="Times New Roman"/>
                 <w:sz w:val="18"/>
               </w:rPr>
-              <w:t>17</w:t>
+              <w:t>21</w:t>
             </w:r>
           </w:p>
         </w:tc>
@@ -2958,7 +2958,7 @@
                 <w:rFonts w:ascii="Times New Roman" w:hAnsi="Times New Roman"/>
                 <w:sz w:val="18"/>
               </w:rPr>
-              <w:t>18</w:t>
+              <w:t>22</w:t>
             </w:r>
           </w:p>
         </w:tc>
@@ -3005,7 +3005,7 @@
                 <w:rFonts w:ascii="Times New Roman" w:hAnsi="Times New Roman"/>
                 <w:sz w:val="18"/>
               </w:rPr>
-              <w:t>18</w:t>
+              <w:t>22</w:t>
             </w:r>
           </w:p>
         </w:tc>
@@ -3052,7 +3052,7 @@
                 <w:rFonts w:ascii="Times New Roman" w:hAnsi="Times New Roman"/>
                 <w:sz w:val="18"/>
               </w:rPr>
-              <w:t>19</w:t>
+              <w:t>23</w:t>
             </w:r>
           </w:p>
         </w:tc>
@@ -3099,7 +3099,7 @@
                 <w:rFonts w:ascii="Times New Roman" w:hAnsi="Times New Roman"/>
                 <w:sz w:val="18"/>
               </w:rPr>
-              <w:t>19</w:t>
+              <w:t>23</w:t>
             </w:r>
           </w:p>
         </w:tc>
@@ -3146,7 +3146,7 @@
                 <w:rFonts w:ascii="Times New Roman" w:hAnsi="Times New Roman"/>
                 <w:sz w:val="18"/>
               </w:rPr>
-              <w:t>20</w:t>
+              <w:t>24</w:t>
             </w:r>
           </w:p>
         </w:tc>
@@ -3193,7 +3193,7 @@
                 <w:rFonts w:ascii="Times New Roman" w:hAnsi="Times New Roman"/>
                 <w:sz w:val="18"/>
               </w:rPr>
-              <w:t>20</w:t>
+              <w:t>24</w:t>
             </w:r>
           </w:p>
         </w:tc>
@@ -3240,7 +3240,7 @@
                 <w:rFonts w:ascii="Times New Roman" w:hAnsi="Times New Roman"/>
                 <w:sz w:val="18"/>
               </w:rPr>
-              <w:t>21</w:t>
+              <w:t>25</w:t>
             </w:r>
           </w:p>
         </w:tc>
@@ -3287,7 +3287,7 @@
                 <w:rFonts w:ascii="Times New Roman" w:hAnsi="Times New Roman"/>
                 <w:sz w:val="18"/>
               </w:rPr>
-              <w:t>21</w:t>
+              <w:t>25</w:t>
             </w:r>
           </w:p>
         </w:tc>
@@ -3334,7 +3334,7 @@
                 <w:rFonts w:ascii="Times New Roman" w:hAnsi="Times New Roman"/>
                 <w:sz w:val="18"/>
               </w:rPr>
-              <w:t>21</w:t>
+              <w:t>25</w:t>
             </w:r>
           </w:p>
         </w:tc>
@@ -3383,7 +3383,7 @@
                 <w:b/>
                 <w:sz w:val="18"/>
               </w:rPr>
-              <w:t>22</w:t>
+              <w:t>26</w:t>
             </w:r>
           </w:p>
         </w:tc>
@@ -3430,7 +3430,7 @@
                 <w:rFonts w:ascii="Times New Roman" w:hAnsi="Times New Roman"/>
                 <w:sz w:val="18"/>
               </w:rPr>
-              <w:t>22</w:t>
+              <w:t>26</w:t>
             </w:r>
           </w:p>
         </w:tc>
@@ -3477,7 +3477,7 @@
                 <w:rFonts w:ascii="Times New Roman" w:hAnsi="Times New Roman"/>
                 <w:sz w:val="18"/>
               </w:rPr>
-              <w:t>22</w:t>
+              <w:t>26</w:t>
             </w:r>
           </w:p>
         </w:tc>
@@ -3526,7 +3526,7 @@
                 <w:b/>
                 <w:sz w:val="18"/>
               </w:rPr>
-              <w:t>23</w:t>
+              <w:t>28</w:t>
             </w:r>
           </w:p>
         </w:tc>
@@ -3561,7 +3561,7 @@
           <w:rFonts w:ascii="Times New Roman" w:hAnsi="Times New Roman"/>
           <w:sz w:val="19"/>
         </w:rPr>
-        <w:t>Table 2.1   Use case scenario - UC-01: Analyze Resume and Detect Skill Gaps                   5</w:t>
+        <w:t>Table 2.1   Use case scenario - UC-01: Analyze Resume and Detect Skill Gaps                   6</w:t>
       </w:r>
     </w:p>
     <w:p>
@@ -3573,7 +3573,7 @@
           <w:rFonts w:ascii="Times New Roman" w:hAnsi="Times New Roman"/>
           <w:sz w:val="19"/>
         </w:rPr>
-        <w:t>Table 3.1   Curated Skill Taxonomy Domain Distribution and Sample Entities                    7</w:t>
+        <w:t>Table 3.1   Curated Skill Taxonomy Domain Distribution and Sample Entities                    8</w:t>
       </w:r>
     </w:p>
     <w:p>
@@ -3585,7 +3585,7 @@
           <w:rFonts w:ascii="Times New Roman" w:hAnsi="Times New Roman"/>
           <w:sz w:val="19"/>
         </w:rPr>
-        <w:t>Table 3.2   Extracted Features and Profiles in the Resume Analysis System                     8</w:t>
+        <w:t>Table 3.2   Extracted Features and Profiles in the Resume Analysis System                     9</w:t>
       </w:r>
     </w:p>
     <w:p>
@@ -3597,7 +3597,7 @@
           <w:rFonts w:ascii="Times New Roman" w:hAnsi="Times New Roman"/>
           <w:sz w:val="19"/>
         </w:rPr>
-        <w:t>Table 4.1   Software and Hardware Environment Specifications                                  11</w:t>
+        <w:t>Table 4.1   Software and Hardware Environment Specifications                                  13</w:t>
       </w:r>
     </w:p>
     <w:p>
@@ -3609,7 +3609,7 @@
           <w:rFonts w:ascii="Times New Roman" w:hAnsi="Times New Roman"/>
           <w:sz w:val="19"/>
         </w:rPr>
-        <w:t>Table 4.2   Functional Test Cases and Verification Results                                    12</w:t>
+        <w:t>Table 4.2   Functional Test Cases and Verification Results                                    14</w:t>
       </w:r>
     </w:p>
     <w:p>
@@ -3621,7 +3621,7 @@
           <w:rFonts w:ascii="Times New Roman" w:hAnsi="Times New Roman"/>
           <w:sz w:val="19"/>
         </w:rPr>
-        <w:t>Table 4.3   Extraction Performance Comparison across Different NLP Approaches                 12</w:t>
+        <w:t>Table 4.3   Extraction Performance Comparison across Different NLP Approaches                 15</w:t>
       </w:r>
     </w:p>
     <w:p>
@@ -3633,7 +3633,7 @@
           <w:rFonts w:ascii="Times New Roman" w:hAnsi="Times New Roman"/>
           <w:sz w:val="19"/>
         </w:rPr>
-        <w:t>Table 4.4   Confusion Matrix for 1,000 Annotated Skill Verification Tokens                    13</w:t>
+        <w:t>Table 4.4   Confusion Matrix for 1,000 Annotated Skill Verification Tokens                    16</w:t>
       </w:r>
     </w:p>
     <w:p>
@@ -3645,7 +3645,7 @@
           <w:rFonts w:ascii="Times New Roman" w:hAnsi="Times New Roman"/>
           <w:sz w:val="19"/>
         </w:rPr>
-        <w:t>Table 5.1   Comparative Analysis of Resume Screening and Analysis Approaches                  16</w:t>
+        <w:t>Table 5.1   Comparative Analysis of Resume Screening and Analysis Approaches                  19</w:t>
       </w:r>
     </w:p>
     <w:p>
@@ -3672,7 +3672,7 @@
           <w:rFonts w:ascii="Times New Roman" w:hAnsi="Times New Roman"/>
           <w:sz w:val="19"/>
         </w:rPr>
-        <w:t>Figure 2.1   Use case diagram for Resume Analysis System                                       5</w:t>
+        <w:t>Figure 2.1   Use case diagram for Resume Analysis System                                       6</w:t>
       </w:r>
     </w:p>
     <w:p>
@@ -3684,7 +3684,7 @@
           <w:rFonts w:ascii="Times New Roman" w:hAnsi="Times New Roman"/>
           <w:sz w:val="19"/>
         </w:rPr>
-        <w:t>Figure 2.2   Sequence diagram of end-to-end resume check                                       6</w:t>
+        <w:t>Figure 2.2   Sequence diagram of end-to-end resume check                                       7</w:t>
       </w:r>
     </w:p>
     <w:p>
@@ -3696,7 +3696,7 @@
           <w:rFonts w:ascii="Times New Roman" w:hAnsi="Times New Roman"/>
           <w:sz w:val="19"/>
         </w:rPr>
-        <w:t>Figure 3.1   System architecture diagram (Five-Layer Architecture)                             7</w:t>
+        <w:t>Figure 3.1   System architecture diagram (Five-Layer Architecture)                             8</w:t>
       </w:r>
     </w:p>
     <w:p>
@@ -3732,7 +3732,7 @@
           <w:rFonts w:ascii="Times New Roman" w:hAnsi="Times New Roman"/>
           <w:sz w:val="19"/>
         </w:rPr>
-        <w:t>Figure 3.4   Level-0 data flow diagram (Context Diagram)                                       9</w:t>
+        <w:t>Figure 3.4   Level-0 data flow diagram (Context Diagram)                                       10</w:t>
       </w:r>
     </w:p>
     <w:p>
@@ -3744,7 +3744,7 @@
           <w:rFonts w:ascii="Times New Roman" w:hAnsi="Times New Roman"/>
           <w:sz w:val="19"/>
         </w:rPr>
-        <w:t>Figure 3.5   Level-1 data flow diagram                                                         9</w:t>
+        <w:t>Figure 3.5   Level-1 data flow diagram                                                         10</w:t>
       </w:r>
     </w:p>
     <w:p>
@@ -3756,7 +3756,7 @@
           <w:rFonts w:ascii="Times New Roman" w:hAnsi="Times New Roman"/>
           <w:sz w:val="19"/>
         </w:rPr>
-        <w:t>Figure 3.6   Activity diagram - operational decision flow                                      10</w:t>
+        <w:t>Figure 3.6   Activity diagram - operational decision flow                                      11</w:t>
       </w:r>
     </w:p>
     <w:p>
@@ -3768,7 +3768,7 @@
           <w:rFonts w:ascii="Times New Roman" w:hAnsi="Times New Roman"/>
           <w:sz w:val="19"/>
         </w:rPr>
-        <w:t>Figure 4.1   Skill taxonomy distribution across technical categories                           11</w:t>
+        <w:t>Figure 4.1   Skill taxonomy distribution across technical categories                           13</w:t>
       </w:r>
     </w:p>
     <w:p>
@@ -3780,7 +3780,7 @@
           <w:rFonts w:ascii="Times New Roman" w:hAnsi="Times New Roman"/>
           <w:sz w:val="19"/>
         </w:rPr>
-        <w:t>Figure 4.2   Home screen and upload interface of web application                               12</w:t>
+        <w:t>Figure 4.2   Home screen and upload interface of web application                               14</w:t>
       </w:r>
     </w:p>
     <w:p>
@@ -3792,7 +3792,7 @@
           <w:rFonts w:ascii="Times New Roman" w:hAnsi="Times New Roman"/>
           <w:sz w:val="19"/>
         </w:rPr>
-        <w:t>Figure 4.3   Result screen for a matched candidate profile                                     12</w:t>
+        <w:t>Figure 4.3   Result screen for a matched candidate profile                                     14</w:t>
       </w:r>
     </w:p>
     <w:p>
@@ -3804,7 +3804,7 @@
           <w:rFonts w:ascii="Times New Roman" w:hAnsi="Times New Roman"/>
           <w:sz w:val="19"/>
         </w:rPr>
-        <w:t>Figure 4.4   Detected skill gaps and personalized upskilling roadmap                           12</w:t>
+        <w:t>Figure 4.4   Detected skill gaps and personalized upskilling roadmap                           15</w:t>
       </w:r>
     </w:p>
     <w:p>
@@ -3816,7 +3816,7 @@
           <w:rFonts w:ascii="Times New Roman" w:hAnsi="Times New Roman"/>
           <w:sz w:val="19"/>
         </w:rPr>
-        <w:t>Figure 4.5   Comparison of extraction methods on benchmark resumes                             13</w:t>
+        <w:t>Figure 4.5   Comparison of extraction methods on benchmark resumes                             15</w:t>
       </w:r>
     </w:p>
     <w:p>
@@ -3828,7 +3828,7 @@
           <w:rFonts w:ascii="Times New Roman" w:hAnsi="Times New Roman"/>
           <w:sz w:val="19"/>
         </w:rPr>
-        <w:t>Figure 4.6   Category-wise skill alignment &amp; gap radar chart                                   13</w:t>
+        <w:t>Figure 4.6   Category-wise skill alignment &amp; gap radar chart                                   16</w:t>
       </w:r>
     </w:p>
     <w:p>
@@ -3840,7 +3840,7 @@
           <w:rFonts w:ascii="Times New Roman" w:hAnsi="Times New Roman"/>
           <w:sz w:val="19"/>
         </w:rPr>
-        <w:t>Figure 4.7   Confusion matrix of skill token detection                                         14</w:t>
+        <w:t>Figure 4.7   Confusion matrix of skill token detection                                         16</w:t>
       </w:r>
     </w:p>
     <w:p>
@@ -3852,7 +3852,7 @@
           <w:rFonts w:ascii="Times New Roman" w:hAnsi="Times New Roman"/>
           <w:sz w:val="19"/>
         </w:rPr>
-        <w:t>Figure 4.8   Top 10 most frequently identified skills in benchmark resumes                     14</w:t>
+        <w:t>Figure 4.8   Top 10 most frequently identified skills in benchmark resumes                     17</w:t>
       </w:r>
     </w:p>
     <w:p>

</xml_diff>